<commit_message>
docs: Word actualizado con arquitectura por capas y mockup en vivo
Co-Authored-By: Paperclip <noreply@paperclip.ing>
</commit_message>
<xml_diff>
--- a/docs/Entrega2_EAFIT.docx
+++ b/docs/Entrega2_EAFIT.docx
@@ -3599,7 +3599,91 @@
           <w:b/>
           <w:color w:val="C00000"/>
         </w:rPr>
-        <w:t>⬛ CAPTURA 10 — De tu herramienta de backlog (Jira / Trello / Azure DevOps): el tablero con las historias de usuario ya cargadas. Pega además la URL del tablero debajo.</w:t>
+        <w:t>⬛ CAPTURA 10 — Backlog creado en GitHub Projects (captura el tablero y pega estas URLs):</w:t>
+      </w:r>
+    </w:p>
+    <w:p>
+      <w:r>
+        <w:rPr>
+          <w:i/>
+        </w:rPr>
+        <w:t xml:space="preserve">- </w:t>
+      </w:r>
+      <w:r>
+        <w:rPr>
+          <w:b/>
+          <w:i/>
+        </w:rPr>
+        <w:t>Tablero (Project):</w:t>
+      </w:r>
+      <w:r>
+        <w:rPr>
+          <w:i/>
+        </w:rPr>
+        <w:t xml:space="preserve"> https://github.com/users/Smonto-06/projects/4</w:t>
+      </w:r>
+    </w:p>
+    <w:p>
+      <w:r>
+        <w:rPr>
+          <w:i/>
+        </w:rPr>
+        <w:t xml:space="preserve">- </w:t>
+      </w:r>
+      <w:r>
+        <w:rPr>
+          <w:b/>
+          <w:i/>
+        </w:rPr>
+        <w:t>Repositorio del proyecto:</w:t>
+      </w:r>
+      <w:r>
+        <w:rPr>
+          <w:i/>
+        </w:rPr>
+        <w:t xml:space="preserve"> https://github.com/Smonto-06/Sistemas_Info</w:t>
+      </w:r>
+    </w:p>
+    <w:p>
+      <w:r>
+        <w:rPr>
+          <w:i/>
+        </w:rPr>
+        <w:t xml:space="preserve">- </w:t>
+      </w:r>
+      <w:r>
+        <w:rPr>
+          <w:b/>
+          <w:i/>
+        </w:rPr>
+        <w:t>Issues (7 HU):</w:t>
+      </w:r>
+      <w:r>
+        <w:rPr>
+          <w:i/>
+        </w:rPr>
+        <w:t xml:space="preserve"> https://github.com/Smonto-06/Sistemas_Info/issues</w:t>
+      </w:r>
+    </w:p>
+    <w:p>
+      <w:r>
+        <w:rPr>
+          <w:i/>
+        </w:rPr>
+        <w:t xml:space="preserve">- </w:t>
+      </w:r>
+      <w:r>
+        <w:rPr>
+          <w:b/>
+          <w:i/>
+        </w:rPr>
+        <w:t>Mockup en vivo:</w:t>
+      </w:r>
+      <w:r>
+        <w:rPr>
+          <w:i/>
+        </w:rPr>
+        <w:t xml:space="preserve"> https://smonto-06.github.io/Sistemas_Info/</w:t>
       </w:r>
     </w:p>
     <w:p/>
@@ -3713,7 +3797,7 @@
           </w:tcPr>
           <w:p>
             <w:r>
-              <w:t>*(marcar al ejecutar)*</w:t>
+              <w:t>✔ Sí (implementado en el mockup)</w:t>
             </w:r>
           </w:p>
         </w:tc>
@@ -3745,7 +3829,7 @@
           </w:tcPr>
           <w:p>
             <w:r>
-              <w:t>*(marcar)*</w:t>
+              <w:t>✔ Sí</w:t>
             </w:r>
           </w:p>
         </w:tc>
@@ -3777,7 +3861,7 @@
           </w:tcPr>
           <w:p>
             <w:r>
-              <w:t>*(marcar)*</w:t>
+              <w:t>✔ Sí</w:t>
             </w:r>
           </w:p>
         </w:tc>
@@ -3809,7 +3893,7 @@
           </w:tcPr>
           <w:p>
             <w:r>
-              <w:t>*(marcar)*</w:t>
+              <w:t>✔ Sí</w:t>
             </w:r>
           </w:p>
         </w:tc>
@@ -3841,7 +3925,7 @@
           </w:tcPr>
           <w:p>
             <w:r>
-              <w:t>*(marcar)*</w:t>
+              <w:t>✔ Sí</w:t>
             </w:r>
           </w:p>
         </w:tc>
@@ -3873,7 +3957,7 @@
           </w:tcPr>
           <w:p>
             <w:r>
-              <w:t>*(marcar)*</w:t>
+              <w:t>✔ Sí</w:t>
             </w:r>
           </w:p>
         </w:tc>
@@ -3905,7 +3989,7 @@
           </w:tcPr>
           <w:p>
             <w:r>
-              <w:t>*(marcar)*</w:t>
+              <w:t>✔ Sí</w:t>
             </w:r>
           </w:p>
         </w:tc>
@@ -3937,7 +4021,7 @@
           </w:tcPr>
           <w:p>
             <w:r>
-              <w:t>*(marcar)*</w:t>
+              <w:t>✔ Sí</w:t>
             </w:r>
           </w:p>
         </w:tc>
@@ -4015,20 +4099,90 @@
     <w:p/>
     <w:p>
       <w:r>
+        <w:t>La arquitectura por capas de la solución se muestra en la Figura 2.</w:t>
+      </w:r>
+    </w:p>
+    <w:p/>
+    <w:p>
+      <w:pPr>
+        <w:jc w:val="center"/>
+      </w:pPr>
+      <w:r>
+        <w:drawing>
+          <wp:inline xmlns:a="http://schemas.openxmlformats.org/drawingml/2006/main" xmlns:pic="http://schemas.openxmlformats.org/drawingml/2006/picture">
+            <wp:extent cx="5760720" cy="3582296"/>
+            <wp:docPr id="2" name="Picture 2"/>
+            <wp:cNvGraphicFramePr>
+              <a:graphicFrameLocks noChangeAspect="1"/>
+            </wp:cNvGraphicFramePr>
+            <a:graphic>
+              <a:graphicData uri="http://schemas.openxmlformats.org/drawingml/2006/picture">
+                <pic:pic>
+                  <pic:nvPicPr>
+                    <pic:cNvPr id="0" name="arquitectura_capas_EAFIT.png"/>
+                    <pic:cNvPicPr/>
+                  </pic:nvPicPr>
+                  <pic:blipFill>
+                    <a:blip r:embed="rId10"/>
+                    <a:stretch>
+                      <a:fillRect/>
+                    </a:stretch>
+                  </pic:blipFill>
+                  <pic:spPr>
+                    <a:xfrm>
+                      <a:off x="0" y="0"/>
+                      <a:ext cx="5760720" cy="3582296"/>
+                    </a:xfrm>
+                    <a:prstGeom prst="rect"/>
+                  </pic:spPr>
+                </pic:pic>
+              </a:graphicData>
+            </a:graphic>
+          </wp:inline>
+        </w:drawing>
+      </w:r>
+    </w:p>
+    <w:p>
+      <w:pPr>
+        <w:jc w:val="center"/>
+      </w:pPr>
+      <w:r>
+        <w:rPr>
+          <w:i/>
+          <w:sz w:val="18"/>
+        </w:rPr>
+        <w:t>Figura 2. Arquitectura por capas (To Be).</w:t>
+      </w:r>
+    </w:p>
+    <w:p>
+      <w:r>
+        <w:rPr>
+          <w:i/>
+        </w:rPr>
+        <w:t>*Figura 2. Arquitectura por capas (To Be): Presentación (dashboard web) · Lógica/Automatización · Integración (SNMP/API + sensores ESP32) · Datos.*</w:t>
+      </w:r>
+    </w:p>
+    <w:p>
+      <w:r>
+        <w:t xml:space="preserve">Los mockups del Sprint 1 ya están </w:t>
+      </w:r>
+      <w:r>
+        <w:rPr>
+          <w:b/>
+        </w:rPr>
+        <w:t>implementados y funcionales</w:t>
+      </w:r>
+      <w:r>
+        <w:t xml:space="preserve"> en https://smonto-06.github.io/Sistemas_Info/</w:t>
+      </w:r>
+    </w:p>
+    <w:p>
+      <w:r>
         <w:rPr>
           <w:b/>
           <w:color w:val="C00000"/>
         </w:rPr>
-        <w:t>⬛ CAPTURA 11 — Diagrama de arquitectura por capas: dibújalo en draw.io / Lucidchart con las 4 capas descritas arriba y pega la imagen.</w:t>
-      </w:r>
-    </w:p>
-    <w:p>
-      <w:r>
-        <w:rPr>
-          <w:b/>
-          <w:color w:val="C00000"/>
-        </w:rPr>
-        <w:t>⬛ CAPTURA 12 — Mockups de las pantallas del Sprint 1 (tablero de monitoreo, alertas y reporte): diséñalos en Figma / Balsamiq y pega las imágenes.</w:t>
+        <w:t>⬛ CAPTURA 12 — Abre el mockup en vivo y toma captura de las 3 vistas: Monitoreo (HU-01), Alertas (HU-02) y Reportes (HU-03).</w:t>
       </w:r>
     </w:p>
     <w:p/>

</xml_diff>

<commit_message>
docs: bibliografia APA en el informe
Co-Authored-By: Paperclip <noreply@paperclip.ing>
</commit_message>
<xml_diff>
--- a/docs/Entrega2_EAFIT.docx
+++ b/docs/Entrega2_EAFIT.docx
@@ -4281,9 +4281,91 @@
         <w:t>BIBLIOGRAFÍA</w:t>
       </w:r>
     </w:p>
+    <w:p/>
     <w:p>
       <w:r>
-        <w:t>*(Completar con las fuentes consultadas en formato APA/IEEE — instrumento del curso, documentación de EAFIT, referencias de las tecnologías propuestas — y adjuntarla en el ZIP de anexos.)*</w:t>
+        <w:t>Referencias en formato APA 7. *(Deja solo las que efectivamente consultaron y agrega el instrumento/diagnóstico del curso — p. ej. el diagnóstico CEIPA que menciona la guía.)*</w:t>
+      </w:r>
+    </w:p>
+    <w:p/>
+    <w:p>
+      <w:pPr>
+        <w:pStyle w:val="ListBullet"/>
+      </w:pPr>
+      <w:r>
+        <w:t>AXELOS. (2019). *ITIL Foundation: ITIL 4 Edition*. TSO.</w:t>
+      </w:r>
+    </w:p>
+    <w:p>
+      <w:pPr>
+        <w:pStyle w:val="ListBullet"/>
+      </w:pPr>
+      <w:r>
+        <w:t>Case, J., Fedor, M., Schoffstall, M., &amp; Davin, J. (1990). *A Simple Network Management Protocol (SNMP)* (RFC 1157). Internet Engineering Task Force. https://www.rfc-editor.org/rfc/rfc1157</w:t>
+      </w:r>
+    </w:p>
+    <w:p>
+      <w:pPr>
+        <w:pStyle w:val="ListBullet"/>
+      </w:pPr>
+      <w:r>
+        <w:t>Cohn, M. (2004). *User Stories Applied: For Agile Software Development*. Addison-Wesley.</w:t>
+      </w:r>
+    </w:p>
+    <w:p>
+      <w:pPr>
+        <w:pStyle w:val="ListBullet"/>
+      </w:pPr>
+      <w:r>
+        <w:t>GitHub. (s. f.). *About Projects*. GitHub Docs. Recuperado el 16 de octubre de 2026, de https://docs.github.com/issues/planning-and-tracking-with-projects</w:t>
+      </w:r>
+    </w:p>
+    <w:p>
+      <w:pPr>
+        <w:pStyle w:val="ListBullet"/>
+      </w:pPr>
+      <w:r>
+        <w:t>Kimball, R., &amp; Caserta, J. (2004). *The Data Warehouse ETL Toolkit*. Wiley.</w:t>
+      </w:r>
+    </w:p>
+    <w:p>
+      <w:pPr>
+        <w:pStyle w:val="ListBullet"/>
+      </w:pPr>
+      <w:r>
+        <w:t>Object Management Group. (2013). *Business Process Model and Notation (BPMN), versión 2.0.2*. https://www.omg.org/spec/BPMN/</w:t>
+      </w:r>
+    </w:p>
+    <w:p>
+      <w:pPr>
+        <w:pStyle w:val="ListBullet"/>
+      </w:pPr>
+      <w:r>
+        <w:t>Russell, S., &amp; Norvig, P. (2021). *Artificial Intelligence: A Modern Approach* (4.ª ed.). Pearson.</w:t>
+      </w:r>
+    </w:p>
+    <w:p>
+      <w:pPr>
+        <w:pStyle w:val="ListBullet"/>
+      </w:pPr>
+      <w:r>
+        <w:t>Schwaber, K., &amp; Sutherland, J. (2020). *La Guía de Scrum*. https://scrumguides.org</w:t>
+      </w:r>
+    </w:p>
+    <w:p>
+      <w:pPr>
+        <w:pStyle w:val="ListBullet"/>
+      </w:pPr>
+      <w:r>
+        <w:t>Universidad EAFIT. (s. f.). *Sitio web institucional*. Recuperado el 16 de octubre de 2026, de https://www.eafit.edu.co</w:t>
+      </w:r>
+    </w:p>
+    <w:p>
+      <w:pPr>
+        <w:pStyle w:val="ListBullet"/>
+      </w:pPr>
+      <w:r>
+        <w:t>van der Aalst, W. M. P., Bichler, M., &amp; Heinzl, A. (2018). Robotic Process Automation. *Business &amp; Information Systems Engineering, 60*(4), 269–272. https://doi.org/10.1007/s12599-018-0542-4</w:t>
       </w:r>
     </w:p>
     <w:p/>

</xml_diff>

<commit_message>
docs: nota de fuente primaria y referencias del instrumento/CEIPA
Co-Authored-By: Paperclip <noreply@paperclip.ing>
</commit_message>
<xml_diff>
--- a/docs/Entrega2_EAFIT.docx
+++ b/docs/Entrega2_EAFIT.docx
@@ -932,7 +932,25 @@
     </w:p>
     <w:p>
       <w:r>
-        <w:t>El diagnóstico se realizó con el instrumento del curso (7 dimensiones, 36 indicadores calificados de 1 a 5 con evidencia). El resultado global del área de Infraestructura TI – Redes de EAFIT es:</w:t>
+        <w:t xml:space="preserve">El diagnóstico se realizó con el instrumento del curso (7 dimensiones, 36 indicadores calificados de 1 a 5 con evidencia). Los datos aquí presentados son </w:t>
+      </w:r>
+      <w:r>
+        <w:rPr>
+          <w:b/>
+        </w:rPr>
+        <w:t>fuente primaria (elaboración propia)</w:t>
+      </w:r>
+      <w:r>
+        <w:t xml:space="preserve">: resultan del diagnóstico aplicado al área de Infraestructura TI – Redes de EAFIT con base en la evidencia aportada por el contacto. El </w:t>
+      </w:r>
+      <w:r>
+        <w:rPr>
+          <w:b/>
+        </w:rPr>
+        <w:t>instrumento</w:t>
+      </w:r>
+      <w:r>
+        <w:t xml:space="preserve"> utilizado es el provisto por el curso, construido a partir de un benchmark de metodologías gratuitas de madurez digital que incluye el diagnóstico CEIPA como referencia (ver pestaña «0. Instrucciones» del archivo de diagnóstico). El resultado global del área de Infraestructura TI – Redes de EAFIT es:</w:t>
       </w:r>
     </w:p>
     <w:p/>
@@ -4357,6 +4375,22 @@
         <w:pStyle w:val="ListBullet"/>
       </w:pPr>
       <w:r>
+        <w:t>CEIPA Powered by Arizona State University. (s. f.). *Diagnóstico de madurez digital* [instrumento en línea]. *(Agrega el enlace exacto que compartió el profesor.)*</w:t>
+      </w:r>
+    </w:p>
+    <w:p>
+      <w:pPr>
+        <w:pStyle w:val="ListBullet"/>
+      </w:pPr>
+      <w:r>
+        <w:t>Universidad EAFIT, Cátedra Sistemas de Información. (2026). *Instrumento de diagnóstico de madurez tecnológica/digital — Fase 2* [instrumento de clase]. Departamento de Informática y Sistemas.</w:t>
+      </w:r>
+    </w:p>
+    <w:p>
+      <w:pPr>
+        <w:pStyle w:val="ListBullet"/>
+      </w:pPr>
+      <w:r>
         <w:t>Universidad EAFIT. (s. f.). *Sitio web institucional*. Recuperado el 16 de octubre de 2026, de https://www.eafit.edu.co</w:t>
       </w:r>
     </w:p>

</xml_diff>